<commit_message>
Proposal: course and supervisor names; drop individual responsibilities
Co-Authored-By: Claude Opus 5.5 <noreply@anthropic.com>
</commit_message>
<xml_diff>
--- a/docs/proposal/Research_Proposal_Project10.docx
+++ b/docs/proposal/Research_Proposal_Project10.docx
@@ -84,7 +84,7 @@
           <w:bCs w:val="0"/>
           <w:rtl w:val="0"/>
         </w:rPr>
-        <w:t xml:space="preserve"> [Course name]</w:t>
+        <w:t xml:space="preserve"> Advanced Techniques in Information Retrieval</w:t>
       </w:r>
       <w:r>
         <w:rPr>
@@ -110,7 +110,7 @@
           <w:bCs w:val="0"/>
           <w:rtl w:val="0"/>
         </w:rPr>
-        <w:t xml:space="preserve"> [Supervisor's full name]</w:t>
+        <w:t xml:space="preserve"> Marina Litvak</w:t>
       </w:r>
       <w:r>
         <w:rPr>
@@ -4775,32 +4775,6 @@
         <w:spacing w:after="0" w:lineRule="auto"/>
         <w:rPr/>
       </w:pPr>
-      <w:r>
-        <w:rPr>
-          <w:rtl w:val="0"/>
-        </w:rPr>
-      </w:r>
-    </w:p>
-    <w:p>
-      <w:pPr>
-        <w:rPr/>
-      </w:pPr>
-      <w:r>
-        <w:rPr>
-          <w:b w:val="1"/>
-          <w:bCs w:val="1"/>
-          <w:rtl w:val="0"/>
-        </w:rPr>
-        <w:t xml:space="preserve">Individual responsibilities for group projects:</w:t>
-      </w:r>
-      <w:r>
-        <w:rPr>
-          <w:b w:val="0"/>
-          <w:bCs w:val="0"/>
-          <w:rtl w:val="0"/>
-        </w:rPr>
-        <w:t xml:space="preserve"> [Specify each student's contribution and shared responsibilities.]</w:t>
-      </w:r>
       <w:r>
         <w:rPr>
           <w:rtl w:val="0"/>

</xml_diff>